<commit_message>
Mise à jour V4
</commit_message>
<xml_diff>
--- a/MP-frontend/public/templates/NotificationApprobation.docx
+++ b/MP-frontend/public/templates/NotificationApprobation.docx
@@ -105,7 +105,7 @@
                     </wp:anchor>
                   </w:drawing>
                 </mc:Choice>
-                <mc:Fallback xmlns:w16sdtdh="http://schemas.microsoft.com/office/word/2020/wordml/sdtdatahash" xmlns:w16du="http://schemas.microsoft.com/office/word/2023/wordml/word16du" xmlns:w16="http://schemas.microsoft.com/office/word/2018/wordml" xmlns:w16cid="http://schemas.microsoft.com/office/word/2016/wordml/cid" xmlns:w16cex="http://schemas.microsoft.com/office/word/2018/wordml/cex" xmlns:oel="http://schemas.microsoft.com/office/2019/extlst" xmlns:am3d="http://schemas.microsoft.com/office/drawing/2017/model3d" xmlns:aink="http://schemas.microsoft.com/office/drawing/2016/ink" xmlns:cx8="http://schemas.microsoft.com/office/drawing/2016/5/14/chartex" xmlns:cx7="http://schemas.microsoft.com/office/drawing/2016/5/13/chartex" xmlns:cx6="http://schemas.microsoft.com/office/drawing/2016/5/12/chartex" xmlns:cx5="http://schemas.microsoft.com/office/drawing/2016/5/11/chartex" xmlns:cx4="http://schemas.microsoft.com/office/drawing/2016/5/10/chartex" xmlns:cx3="http://schemas.microsoft.com/office/drawing/2016/5/9/chartex" xmlns:cx2="http://schemas.microsoft.com/office/drawing/2015/10/21/chartex">
+                <mc:Fallback xmlns:cx2="http://schemas.microsoft.com/office/drawing/2015/10/21/chartex" xmlns:cx3="http://schemas.microsoft.com/office/drawing/2016/5/9/chartex" xmlns:cx4="http://schemas.microsoft.com/office/drawing/2016/5/10/chartex" xmlns:cx5="http://schemas.microsoft.com/office/drawing/2016/5/11/chartex" xmlns:cx6="http://schemas.microsoft.com/office/drawing/2016/5/12/chartex" xmlns:cx7="http://schemas.microsoft.com/office/drawing/2016/5/13/chartex" xmlns:cx8="http://schemas.microsoft.com/office/drawing/2016/5/14/chartex" xmlns:aink="http://schemas.microsoft.com/office/drawing/2016/ink" xmlns:am3d="http://schemas.microsoft.com/office/drawing/2017/model3d" xmlns:oel="http://schemas.microsoft.com/office/2019/extlst" xmlns:w16cex="http://schemas.microsoft.com/office/word/2018/wordml/cex" xmlns:w16cid="http://schemas.microsoft.com/office/word/2016/wordml/cid" xmlns:w16="http://schemas.microsoft.com/office/word/2018/wordml" xmlns:w16du="http://schemas.microsoft.com/office/word/2023/wordml/word16du" xmlns:w16sdtdh="http://schemas.microsoft.com/office/word/2020/wordml/sdtdatahash">
                   <w:pict>
                     <v:line w14:anchorId="3F11EF99" id="Line 2" o:spid="_x0000_s1026" style="position:absolute;z-index:251660288;visibility:visible;mso-wrap-style:square;mso-width-percent:0;mso-height-percent:0;mso-wrap-distance-left:9pt;mso-wrap-distance-top:0;mso-wrap-distance-right:9pt;mso-wrap-distance-bottom:0;mso-position-horizontal:absolute;mso-position-horizontal-relative:page;mso-position-vertical:absolute;mso-position-vertical-relative:page;mso-width-percent:0;mso-height-percent:0;mso-width-relative:page;mso-height-relative:page" from="81.3pt,27.2pt" to="149.35pt,27.2pt" o:gfxdata="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" strokecolor="#36f">
                       <w10:wrap anchorx="page" anchory="page"/>
@@ -289,7 +289,47 @@
                 <w:szCs w:val="24"/>
                 <w:lang w:eastAsia="fr-FR"/>
               </w:rPr>
-              <w:t>{Objet]</w:t>
+              <w:t>{</w:t>
+            </w:r>
+            <w:r>
+              <w:t xml:space="preserve"> </w:t>
+            </w:r>
+            <w:proofErr w:type="spellStart"/>
+            <w:r>
+              <w:rPr>
+                <w:rFonts w:ascii="Times New Roman" w:eastAsia="Times New Roman" w:hAnsi="Times New Roman"/>
+                <w:b/>
+                <w:bCs/>
+                <w:sz w:val="24"/>
+                <w:szCs w:val="24"/>
+                <w:lang w:eastAsia="fr-FR"/>
+              </w:rPr>
+              <w:t>objetMarche</w:t>
+            </w:r>
+            <w:proofErr w:type="spellEnd"/>
+            <w:r>
+              <w:rPr>
+                <w:rFonts w:ascii="Times New Roman" w:eastAsia="Times New Roman" w:hAnsi="Times New Roman"/>
+                <w:b/>
+                <w:bCs/>
+                <w:sz w:val="24"/>
+                <w:szCs w:val="24"/>
+                <w:lang w:eastAsia="fr-FR"/>
+              </w:rPr>
+              <w:t xml:space="preserve"> </w:t>
+            </w:r>
+            <w:bookmarkStart w:id="0" w:name="_GoBack"/>
+            <w:bookmarkEnd w:id="0"/>
+            <w:r>
+              <w:rPr>
+                <w:rFonts w:ascii="Times New Roman" w:eastAsia="Times New Roman" w:hAnsi="Times New Roman"/>
+                <w:b/>
+                <w:bCs/>
+                <w:sz w:val="24"/>
+                <w:szCs w:val="24"/>
+                <w:lang w:eastAsia="fr-FR"/>
+              </w:rPr>
+              <w:t>}</w:t>
             </w:r>
           </w:p>
         </w:tc>
@@ -790,29 +830,22 @@
           <w:b/>
           <w:bCs/>
         </w:rPr>
-        <w:t>}</w:t>
+        <w:t xml:space="preserve">} </w:t>
+      </w:r>
+      <w:r>
+        <w:t xml:space="preserve">Relatif </w:t>
+      </w:r>
+      <w:r>
+        <w:t>à</w:t>
+      </w:r>
+      <w:r>
+        <w:t xml:space="preserve"> : </w:t>
       </w:r>
       <w:r>
         <w:rPr>
           <w:b/>
           <w:bCs/>
         </w:rPr>
-        <w:t xml:space="preserve"> </w:t>
-      </w:r>
-      <w:r>
-        <w:t xml:space="preserve">Relatif </w:t>
-      </w:r>
-      <w:r>
-        <w:t>à</w:t>
-      </w:r>
-      <w:r>
-        <w:t xml:space="preserve"> : </w:t>
-      </w:r>
-      <w:r>
-        <w:rPr>
-          <w:b/>
-          <w:bCs/>
-        </w:rPr>
         <w:t xml:space="preserve">Travaux de confection, mise en place, peinture et écriture des bornes des points de repère du réseau routier RN et RR relevant de la D.R.E.T.L de SOUS MASSA </w:t>
       </w:r>
       <w:r>
@@ -831,12 +864,7 @@
         <w:t>/</w:t>
       </w:r>
       <w:r>
-        <w:t>20</w:t>
-      </w:r>
-      <w:bookmarkStart w:id="0" w:name="_GoBack"/>
-      <w:bookmarkEnd w:id="0"/>
-      <w:r>
-        <w:t>2</w:t>
+        <w:t>202</w:t>
       </w:r>
       <w:r>
         <w:t>4</w:t>
@@ -1337,7 +1365,7 @@
                     </wp:anchor>
                   </w:drawing>
                 </mc:Choice>
-                <mc:Fallback xmlns:w16sdtdh="http://schemas.microsoft.com/office/word/2020/wordml/sdtdatahash" xmlns:w16du="http://schemas.microsoft.com/office/word/2023/wordml/word16du" xmlns:w16="http://schemas.microsoft.com/office/word/2018/wordml" xmlns:w16cid="http://schemas.microsoft.com/office/word/2016/wordml/cid" xmlns:w16cex="http://schemas.microsoft.com/office/word/2018/wordml/cex" xmlns:oel="http://schemas.microsoft.com/office/2019/extlst" xmlns:am3d="http://schemas.microsoft.com/office/drawing/2017/model3d" xmlns:aink="http://schemas.microsoft.com/office/drawing/2016/ink" xmlns:cx8="http://schemas.microsoft.com/office/drawing/2016/5/14/chartex" xmlns:cx7="http://schemas.microsoft.com/office/drawing/2016/5/13/chartex" xmlns:cx6="http://schemas.microsoft.com/office/drawing/2016/5/12/chartex" xmlns:cx5="http://schemas.microsoft.com/office/drawing/2016/5/11/chartex" xmlns:cx4="http://schemas.microsoft.com/office/drawing/2016/5/10/chartex" xmlns:cx3="http://schemas.microsoft.com/office/drawing/2016/5/9/chartex" xmlns:cx2="http://schemas.microsoft.com/office/drawing/2015/10/21/chartex">
+                <mc:Fallback xmlns:cx2="http://schemas.microsoft.com/office/drawing/2015/10/21/chartex" xmlns:cx3="http://schemas.microsoft.com/office/drawing/2016/5/9/chartex" xmlns:cx4="http://schemas.microsoft.com/office/drawing/2016/5/10/chartex" xmlns:cx5="http://schemas.microsoft.com/office/drawing/2016/5/11/chartex" xmlns:cx6="http://schemas.microsoft.com/office/drawing/2016/5/12/chartex" xmlns:cx7="http://schemas.microsoft.com/office/drawing/2016/5/13/chartex" xmlns:cx8="http://schemas.microsoft.com/office/drawing/2016/5/14/chartex" xmlns:aink="http://schemas.microsoft.com/office/drawing/2016/ink" xmlns:am3d="http://schemas.microsoft.com/office/drawing/2017/model3d" xmlns:oel="http://schemas.microsoft.com/office/2019/extlst" xmlns:w16cex="http://schemas.microsoft.com/office/word/2018/wordml/cex" xmlns:w16cid="http://schemas.microsoft.com/office/word/2016/wordml/cid" xmlns:w16="http://schemas.microsoft.com/office/word/2018/wordml" xmlns:w16du="http://schemas.microsoft.com/office/word/2023/wordml/word16du" xmlns:w16sdtdh="http://schemas.microsoft.com/office/word/2020/wordml/sdtdatahash">
                   <w:pict>
                     <v:line w14:anchorId="24585022" id="Line 3" o:spid="_x0000_s1026" style="position:absolute;z-index:251661312;visibility:visible;mso-wrap-style:square;mso-width-percent:0;mso-height-percent:0;mso-wrap-distance-left:9pt;mso-wrap-distance-top:0;mso-wrap-distance-right:9pt;mso-wrap-distance-bottom:0;mso-position-horizontal:absolute;mso-position-horizontal-relative:page;mso-position-vertical:absolute;mso-position-vertical-relative:page;mso-width-percent:0;mso-height-percent:0;mso-width-relative:page;mso-height-relative:page" from="81.3pt,40.7pt" to="149.35pt,40.7pt" o:gfxdata="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" strokecolor="#36f">
                       <w10:wrap anchorx="page" anchory="page"/>

</xml_diff>